<commit_message>
Update config and Layer 1 catalog
Made-with: Cursor
</commit_message>
<xml_diff>
--- a/Layer 1 - Catalog - Categories (9) - Services (22) - Memberships (1).docx/Layer 1 - Catalog - Categories (9) - Services (22) - Memberships (1).docx.docx
+++ b/Layer 1 - Catalog - Categories (9) - Services (22) - Memberships (1).docx/Layer 1 - Catalog - Categories (9) - Services (22) - Memberships (1).docx.docx
@@ -61,7 +61,7 @@
     <w:p>
       <w:r>
         <w:pict w14:anchorId="5FCE3551">
-          <v:rect id="_x0000_i1244" style="width:0;height:1.5pt" o:hralign="center" o:hrstd="t" o:hr="t" fillcolor="#a0a0a0" stroked="f"/>
+          <v:rect id="_x0000_i1025" style="width:0;height:1.5pt" o:hralign="center" o:hrstd="t" o:hr="t" fillcolor="#a0a0a0" stroked="f"/>
         </w:pict>
       </w:r>
     </w:p>
@@ -114,7 +114,7 @@
     <w:p>
       <w:r>
         <w:pict w14:anchorId="04E05F89">
-          <v:rect id="_x0000_i1245" style="width:0;height:1.5pt" o:hralign="center" o:hrstd="t" o:hr="t" fillcolor="#a0a0a0" stroked="f"/>
+          <v:rect id="_x0000_i1026" style="width:0;height:1.5pt" o:hralign="center" o:hrstd="t" o:hr="t" fillcolor="#a0a0a0" stroked="f"/>
         </w:pict>
       </w:r>
     </w:p>
@@ -150,7 +150,7 @@
     <w:p>
       <w:r>
         <w:pict w14:anchorId="2EBDCEF5">
-          <v:rect id="_x0000_i1246" style="width:0;height:1.5pt" o:hralign="center" o:hrstd="t" o:hr="t" fillcolor="#a0a0a0" stroked="f"/>
+          <v:rect id="_x0000_i1027" style="width:0;height:1.5pt" o:hralign="center" o:hrstd="t" o:hr="t" fillcolor="#a0a0a0" stroked="f"/>
         </w:pict>
       </w:r>
     </w:p>
@@ -186,7 +186,7 @@
     <w:p>
       <w:r>
         <w:pict w14:anchorId="42B94BB8">
-          <v:rect id="_x0000_i1247" style="width:0;height:1.5pt" o:hralign="center" o:hrstd="t" o:hr="t" fillcolor="#a0a0a0" stroked="f"/>
+          <v:rect id="_x0000_i1028" style="width:0;height:1.5pt" o:hralign="center" o:hrstd="t" o:hr="t" fillcolor="#a0a0a0" stroked="f"/>
         </w:pict>
       </w:r>
     </w:p>
@@ -230,7 +230,7 @@
       <w:r>
         <w:lastRenderedPageBreak/>
         <w:pict w14:anchorId="599AACF5">
-          <v:rect id="_x0000_i1248" style="width:0;height:1.5pt" o:hralign="center" o:hrstd="t" o:hr="t" fillcolor="#a0a0a0" stroked="f"/>
+          <v:rect id="_x0000_i1029" style="width:0;height:1.5pt" o:hralign="center" o:hrstd="t" o:hr="t" fillcolor="#a0a0a0" stroked="f"/>
         </w:pict>
       </w:r>
     </w:p>
@@ -276,7 +276,7 @@
     <w:p>
       <w:r>
         <w:pict w14:anchorId="1DEA080D">
-          <v:rect id="_x0000_i1249" style="width:0;height:1.5pt" o:hralign="center" o:hrstd="t" o:hr="t" fillcolor="#a0a0a0" stroked="f"/>
+          <v:rect id="_x0000_i1030" style="width:0;height:1.5pt" o:hralign="center" o:hrstd="t" o:hr="t" fillcolor="#a0a0a0" stroked="f"/>
         </w:pict>
       </w:r>
     </w:p>
@@ -326,7 +326,7 @@
     <w:p>
       <w:r>
         <w:pict w14:anchorId="3643946B">
-          <v:rect id="_x0000_i1250" style="width:0;height:1.5pt" o:hralign="center" o:hrstd="t" o:hr="t" fillcolor="#a0a0a0" stroked="f"/>
+          <v:rect id="_x0000_i1031" style="width:0;height:1.5pt" o:hralign="center" o:hrstd="t" o:hr="t" fillcolor="#a0a0a0" stroked="f"/>
         </w:pict>
       </w:r>
     </w:p>
@@ -376,7 +376,7 @@
     <w:p>
       <w:r>
         <w:pict w14:anchorId="59A1A177">
-          <v:rect id="_x0000_i1251" style="width:0;height:1.5pt" o:hralign="center" o:hrstd="t" o:hr="t" fillcolor="#a0a0a0" stroked="f"/>
+          <v:rect id="_x0000_i1032" style="width:0;height:1.5pt" o:hralign="center" o:hrstd="t" o:hr="t" fillcolor="#a0a0a0" stroked="f"/>
         </w:pict>
       </w:r>
     </w:p>
@@ -426,7 +426,7 @@
     <w:p>
       <w:r>
         <w:pict w14:anchorId="28BC2ED8">
-          <v:rect id="_x0000_i1252" style="width:0;height:1.5pt" o:hralign="center" o:hrstd="t" o:hr="t" fillcolor="#a0a0a0" stroked="f"/>
+          <v:rect id="_x0000_i1033" style="width:0;height:1.5pt" o:hralign="center" o:hrstd="t" o:hr="t" fillcolor="#a0a0a0" stroked="f"/>
         </w:pict>
       </w:r>
     </w:p>
@@ -476,7 +476,7 @@
     <w:p>
       <w:r>
         <w:pict w14:anchorId="565DDB6D">
-          <v:rect id="_x0000_i1253" style="width:0;height:1.5pt" o:hralign="center" o:hrstd="t" o:hr="t" fillcolor="#a0a0a0" stroked="f"/>
+          <v:rect id="_x0000_i1034" style="width:0;height:1.5pt" o:hralign="center" o:hrstd="t" o:hr="t" fillcolor="#a0a0a0" stroked="f"/>
         </w:pict>
       </w:r>
     </w:p>
@@ -555,7 +555,7 @@
     <w:p>
       <w:r>
         <w:pict w14:anchorId="69B7BEF5">
-          <v:rect id="_x0000_i1254" style="width:0;height:1.5pt" o:hralign="center" o:hrstd="t" o:hr="t" fillcolor="#a0a0a0" stroked="f"/>
+          <v:rect id="_x0000_i1035" style="width:0;height:1.5pt" o:hralign="center" o:hrstd="t" o:hr="t" fillcolor="#a0a0a0" stroked="f"/>
         </w:pict>
       </w:r>
     </w:p>
@@ -605,7 +605,7 @@
     <w:p>
       <w:r>
         <w:pict w14:anchorId="4925BF74">
-          <v:rect id="_x0000_i1255" style="width:0;height:1.5pt" o:hralign="center" o:hrstd="t" o:hr="t" fillcolor="#a0a0a0" stroked="f"/>
+          <v:rect id="_x0000_i1036" style="width:0;height:1.5pt" o:hralign="center" o:hrstd="t" o:hr="t" fillcolor="#a0a0a0" stroked="f"/>
         </w:pict>
       </w:r>
     </w:p>
@@ -655,7 +655,7 @@
     <w:p>
       <w:r>
         <w:pict w14:anchorId="482EA80C">
-          <v:rect id="_x0000_i1256" style="width:0;height:1.5pt" o:hralign="center" o:hrstd="t" o:hr="t" fillcolor="#a0a0a0" stroked="f"/>
+          <v:rect id="_x0000_i1037" style="width:0;height:1.5pt" o:hralign="center" o:hrstd="t" o:hr="t" fillcolor="#a0a0a0" stroked="f"/>
         </w:pict>
       </w:r>
     </w:p>
@@ -705,7 +705,7 @@
     <w:p>
       <w:r>
         <w:pict w14:anchorId="40F1A535">
-          <v:rect id="_x0000_i1257" style="width:0;height:1.5pt" o:hralign="center" o:hrstd="t" o:hr="t" fillcolor="#a0a0a0" stroked="f"/>
+          <v:rect id="_x0000_i1038" style="width:0;height:1.5pt" o:hralign="center" o:hrstd="t" o:hr="t" fillcolor="#a0a0a0" stroked="f"/>
         </w:pict>
       </w:r>
     </w:p>
@@ -755,7 +755,7 @@
     <w:p>
       <w:r>
         <w:pict w14:anchorId="115BBBB9">
-          <v:rect id="_x0000_i1258" style="width:0;height:1.5pt" o:hralign="center" o:hrstd="t" o:hr="t" fillcolor="#a0a0a0" stroked="f"/>
+          <v:rect id="_x0000_i1039" style="width:0;height:1.5pt" o:hralign="center" o:hrstd="t" o:hr="t" fillcolor="#a0a0a0" stroked="f"/>
         </w:pict>
       </w:r>
     </w:p>
@@ -842,7 +842,7 @@
     <w:p>
       <w:r>
         <w:pict w14:anchorId="073D570A">
-          <v:rect id="_x0000_i1259" style="width:0;height:1.5pt" o:hralign="center" o:hrstd="t" o:hr="t" fillcolor="#a0a0a0" stroked="f"/>
+          <v:rect id="_x0000_i1040" style="width:0;height:1.5pt" o:hralign="center" o:hrstd="t" o:hr="t" fillcolor="#a0a0a0" stroked="f"/>
         </w:pict>
       </w:r>
     </w:p>
@@ -892,7 +892,7 @@
     <w:p>
       <w:r>
         <w:pict w14:anchorId="5740E243">
-          <v:rect id="_x0000_i1260" style="width:0;height:1.5pt" o:hralign="center" o:hrstd="t" o:hr="t" fillcolor="#a0a0a0" stroked="f"/>
+          <v:rect id="_x0000_i1041" style="width:0;height:1.5pt" o:hralign="center" o:hrstd="t" o:hr="t" fillcolor="#a0a0a0" stroked="f"/>
         </w:pict>
       </w:r>
     </w:p>
@@ -950,7 +950,7 @@
     <w:p>
       <w:r>
         <w:pict w14:anchorId="6F35170D">
-          <v:rect id="_x0000_i1261" style="width:0;height:1.5pt" o:hralign="center" o:hrstd="t" o:hr="t" fillcolor="#a0a0a0" stroked="f"/>
+          <v:rect id="_x0000_i1042" style="width:0;height:1.5pt" o:hralign="center" o:hrstd="t" o:hr="t" fillcolor="#a0a0a0" stroked="f"/>
         </w:pict>
       </w:r>
     </w:p>
@@ -1016,7 +1016,7 @@
     <w:p>
       <w:r>
         <w:pict w14:anchorId="62C25172">
-          <v:rect id="_x0000_i1262" style="width:0;height:1.5pt" o:hralign="center" o:hrstd="t" o:hr="t" fillcolor="#a0a0a0" stroked="f"/>
+          <v:rect id="_x0000_i1043" style="width:0;height:1.5pt" o:hralign="center" o:hrstd="t" o:hr="t" fillcolor="#a0a0a0" stroked="f"/>
         </w:pict>
       </w:r>
     </w:p>
@@ -1135,7 +1135,7 @@
     <w:p>
       <w:r>
         <w:pict w14:anchorId="53BB68D7">
-          <v:rect id="_x0000_i1263" style="width:0;height:1.5pt" o:hralign="center" o:hrstd="t" o:hr="t" fillcolor="#a0a0a0" stroked="f"/>
+          <v:rect id="_x0000_i1044" style="width:0;height:1.5pt" o:hralign="center" o:hrstd="t" o:hr="t" fillcolor="#a0a0a0" stroked="f"/>
         </w:pict>
       </w:r>
     </w:p>
@@ -1192,7 +1192,7 @@
     <w:p>
       <w:r>
         <w:pict w14:anchorId="57B1E58F">
-          <v:rect id="_x0000_i1264" style="width:0;height:1.5pt" o:hralign="center" o:hrstd="t" o:hr="t" fillcolor="#a0a0a0" stroked="f"/>
+          <v:rect id="_x0000_i1045" style="width:0;height:1.5pt" o:hralign="center" o:hrstd="t" o:hr="t" fillcolor="#a0a0a0" stroked="f"/>
         </w:pict>
       </w:r>
     </w:p>
@@ -1242,7 +1242,7 @@
     <w:p>
       <w:r>
         <w:pict w14:anchorId="5EC0768A">
-          <v:rect id="_x0000_i1265" style="width:0;height:1.5pt" o:hralign="center" o:hrstd="t" o:hr="t" fillcolor="#a0a0a0" stroked="f"/>
+          <v:rect id="_x0000_i1046" style="width:0;height:1.5pt" o:hralign="center" o:hrstd="t" o:hr="t" fillcolor="#a0a0a0" stroked="f"/>
         </w:pict>
       </w:r>
     </w:p>
@@ -1408,7 +1408,7 @@
     <w:p>
       <w:r>
         <w:pict w14:anchorId="189072F0">
-          <v:rect id="_x0000_i1266" style="width:0;height:1.5pt" o:hralign="center" o:hrstd="t" o:hr="t" fillcolor="#a0a0a0" stroked="f"/>
+          <v:rect id="_x0000_i1047" style="width:0;height:1.5pt" o:hralign="center" o:hrstd="t" o:hr="t" fillcolor="#a0a0a0" stroked="f"/>
         </w:pict>
       </w:r>
     </w:p>
@@ -1454,7 +1454,7 @@
     <w:p>
       <w:r>
         <w:pict w14:anchorId="78961CC1">
-          <v:rect id="_x0000_i1267" style="width:0;height:1.5pt" o:hralign="center" o:hrstd="t" o:hr="t" fillcolor="#a0a0a0" stroked="f"/>
+          <v:rect id="_x0000_i1048" style="width:0;height:1.5pt" o:hralign="center" o:hrstd="t" o:hr="t" fillcolor="#a0a0a0" stroked="f"/>
         </w:pict>
       </w:r>
     </w:p>
@@ -1504,7 +1504,7 @@
     <w:p>
       <w:r>
         <w:pict w14:anchorId="31DA0177">
-          <v:rect id="_x0000_i1268" style="width:0;height:1.5pt" o:hralign="center" o:hrstd="t" o:hr="t" fillcolor="#a0a0a0" stroked="f"/>
+          <v:rect id="_x0000_i1049" style="width:0;height:1.5pt" o:hralign="center" o:hrstd="t" o:hr="t" fillcolor="#a0a0a0" stroked="f"/>
         </w:pict>
       </w:r>
     </w:p>
@@ -1647,7 +1647,7 @@
     <w:p>
       <w:r>
         <w:pict w14:anchorId="1376F4B2">
-          <v:rect id="_x0000_i1269" style="width:0;height:1.5pt" o:hralign="center" o:hrstd="t" o:hr="t" fillcolor="#a0a0a0" stroked="f"/>
+          <v:rect id="_x0000_i1050" style="width:0;height:1.5pt" o:hralign="center" o:hrstd="t" o:hr="t" fillcolor="#a0a0a0" stroked="f"/>
         </w:pict>
       </w:r>
     </w:p>
@@ -1697,7 +1697,7 @@
     <w:p>
       <w:r>
         <w:pict w14:anchorId="5596088F">
-          <v:rect id="_x0000_i1270" style="width:0;height:1.5pt" o:hralign="center" o:hrstd="t" o:hr="t" fillcolor="#a0a0a0" stroked="f"/>
+          <v:rect id="_x0000_i1051" style="width:0;height:1.5pt" o:hralign="center" o:hrstd="t" o:hr="t" fillcolor="#a0a0a0" stroked="f"/>
         </w:pict>
       </w:r>
     </w:p>
@@ -1888,7 +1888,7 @@
     <w:p>
       <w:r>
         <w:pict w14:anchorId="77D3431E">
-          <v:rect id="_x0000_i1271" style="width:0;height:1.5pt" o:hralign="center" o:hrstd="t" o:hr="t" fillcolor="#a0a0a0" stroked="f"/>
+          <v:rect id="_x0000_i1052" style="width:0;height:1.5pt" o:hralign="center" o:hrstd="t" o:hr="t" fillcolor="#a0a0a0" stroked="f"/>
         </w:pict>
       </w:r>
     </w:p>
@@ -1938,7 +1938,7 @@
     <w:p>
       <w:r>
         <w:pict w14:anchorId="7EC2C8AF">
-          <v:rect id="_x0000_i1272" style="width:0;height:1.5pt" o:hralign="center" o:hrstd="t" o:hr="t" fillcolor="#a0a0a0" stroked="f"/>
+          <v:rect id="_x0000_i1053" style="width:0;height:1.5pt" o:hralign="center" o:hrstd="t" o:hr="t" fillcolor="#a0a0a0" stroked="f"/>
         </w:pict>
       </w:r>
     </w:p>
@@ -2129,7 +2129,7 @@
     <w:p>
       <w:r>
         <w:pict w14:anchorId="1199EC45">
-          <v:rect id="_x0000_i1273" style="width:0;height:1.5pt" o:hralign="center" o:hrstd="t" o:hr="t" fillcolor="#a0a0a0" stroked="f"/>
+          <v:rect id="_x0000_i1054" style="width:0;height:1.5pt" o:hralign="center" o:hrstd="t" o:hr="t" fillcolor="#a0a0a0" stroked="f"/>
         </w:pict>
       </w:r>
     </w:p>
@@ -2239,7 +2239,7 @@
     <w:p>
       <w:r>
         <w:pict w14:anchorId="014972C2">
-          <v:rect id="_x0000_i1274" style="width:0;height:1.5pt" o:hralign="center" o:hrstd="t" o:hr="t" fillcolor="#a0a0a0" stroked="f"/>
+          <v:rect id="_x0000_i1055" style="width:0;height:1.5pt" o:hralign="center" o:hrstd="t" o:hr="t" fillcolor="#a0a0a0" stroked="f"/>
         </w:pict>
       </w:r>
     </w:p>
@@ -2275,7 +2275,7 @@
     <w:p>
       <w:r>
         <w:pict w14:anchorId="79C439B1">
-          <v:rect id="_x0000_i1275" style="width:0;height:1.5pt" o:hralign="center" o:hrstd="t" o:hr="t" fillcolor="#a0a0a0" stroked="f"/>
+          <v:rect id="_x0000_i1056" style="width:0;height:1.5pt" o:hralign="center" o:hrstd="t" o:hr="t" fillcolor="#a0a0a0" stroked="f"/>
         </w:pict>
       </w:r>
     </w:p>
@@ -2311,7 +2311,7 @@
     <w:p>
       <w:r>
         <w:pict w14:anchorId="77E62480">
-          <v:rect id="_x0000_i1276" style="width:0;height:1.5pt" o:hralign="center" o:hrstd="t" o:hr="t" fillcolor="#a0a0a0" stroked="f"/>
+          <v:rect id="_x0000_i1057" style="width:0;height:1.5pt" o:hralign="center" o:hrstd="t" o:hr="t" fillcolor="#a0a0a0" stroked="f"/>
         </w:pict>
       </w:r>
     </w:p>
@@ -2418,7 +2418,7 @@
         <w:bCs/>
         <w:noProof/>
       </w:rPr>
-      <w:t>2026-02-24</w:t>
+      <w:t>2026-03-05</w:t>
     </w:r>
     <w:r>
       <w:rPr>
@@ -4458,6 +4458,7 @@
   <w:style w:type="character" w:default="1" w:styleId="DefaultParagraphFont">
     <w:name w:val="Default Paragraph Font"/>
     <w:uiPriority w:val="1"/>
+    <w:semiHidden/>
     <w:unhideWhenUsed/>
   </w:style>
   <w:style w:type="table" w:default="1" w:styleId="TableNormal">

</xml_diff>